<commit_message>
feat(plantillas): nuevas plantillas Integral y Empresarial CT/CTP con versiones EIRL y Firma
</commit_message>
<xml_diff>
--- a/public/plantillas/Plantilla_Plan_Integral_EIRL.docx
+++ b/public/plantillas/Plantilla_Plan_Integral_EIRL.docx
@@ -125,11 +125,6 @@
               </w:rPr>
             </w:pPr>
             <w:bookmarkStart w:id="2" w:name="Cliente" w:colFirst="0" w:colLast="0"/>
-            <w:r>
-              <w:rPr>
-                <w:lang w:val="en-US"/>
-              </w:rPr>
-            </w:r>
           </w:p>
         </w:tc>
       </w:tr>
@@ -154,7 +149,6 @@
             </w:pPr>
             <w:bookmarkStart w:id="3" w:name="Atencion" w:colFirst="0" w:colLast="0"/>
             <w:bookmarkEnd w:id="2"/>
-            <w:r/>
           </w:p>
         </w:tc>
       </w:tr>
@@ -3105,8 +3099,6 @@
               </w:rPr>
               <w:t xml:space="preserve"> – Laboral </w:t>
             </w:r>
-            <w:bookmarkStart w:id="8" w:name="_GoBack"/>
-            <w:bookmarkEnd w:id="8"/>
           </w:p>
         </w:tc>
         <w:tc>
@@ -3127,7 +3119,7 @@
                 <w:iCs/>
               </w:rPr>
             </w:pPr>
-            <w:bookmarkStart w:id="9" w:name="UnitAsesoria"/>
+            <w:bookmarkStart w:id="8" w:name="UnitAsesoria"/>
             <w:r>
               <w:rPr>
                 <w:rFonts w:ascii="Calibri" w:eastAsia="Calibri" w:hAnsi="Calibri" w:cs="Calibri"/>
@@ -3136,7 +3128,7 @@
               </w:rPr>
               <w:t>S/ 0.00</w:t>
             </w:r>
-            <w:bookmarkEnd w:id="9"/>
+            <w:bookmarkEnd w:id="8"/>
           </w:p>
         </w:tc>
         <w:tc>
@@ -3157,7 +3149,7 @@
                 <w:iCs/>
               </w:rPr>
             </w:pPr>
-            <w:bookmarkStart w:id="10" w:name="SubTotalAsesoria"/>
+            <w:bookmarkStart w:id="9" w:name="SubTotalAsesoria"/>
             <w:r>
               <w:rPr>
                 <w:rFonts w:ascii="Calibri" w:eastAsia="Calibri" w:hAnsi="Calibri" w:cs="Calibri"/>
@@ -3166,7 +3158,7 @@
               </w:rPr>
               <w:t>S/ 0.00</w:t>
             </w:r>
-            <w:bookmarkEnd w:id="10"/>
+            <w:bookmarkEnd w:id="9"/>
           </w:p>
         </w:tc>
       </w:tr>
@@ -3261,7 +3253,7 @@
                 <w:color w:val="FF0000"/>
               </w:rPr>
             </w:pPr>
-            <w:bookmarkStart w:id="11" w:name="ValDescuento"/>
+            <w:bookmarkStart w:id="10" w:name="ValDescuento"/>
             <w:r>
               <w:rPr>
                 <w:rFonts w:ascii="Calibri" w:eastAsia="Calibri" w:hAnsi="Calibri" w:cs="Calibri"/>
@@ -3271,7 +3263,7 @@
               </w:rPr>
               <w:t>S/ 0.00</w:t>
             </w:r>
-            <w:bookmarkEnd w:id="11"/>
+            <w:bookmarkEnd w:id="10"/>
           </w:p>
         </w:tc>
       </w:tr>
@@ -3336,7 +3328,7 @@
                 <w:bCs/>
               </w:rPr>
             </w:pPr>
-            <w:bookmarkStart w:id="12" w:name="TotalFinal"/>
+            <w:bookmarkStart w:id="11" w:name="TotalFinal"/>
             <w:r>
               <w:rPr>
                 <w:rFonts w:ascii="Calibri" w:eastAsia="Calibri" w:hAnsi="Calibri" w:cs="Calibri"/>
@@ -3347,7 +3339,7 @@
               </w:rPr>
               <w:t>S/ 0.00</w:t>
             </w:r>
-            <w:bookmarkEnd w:id="12"/>
+            <w:bookmarkEnd w:id="11"/>
           </w:p>
         </w:tc>
       </w:tr>
@@ -3431,8 +3423,8 @@
           <w:rFonts w:ascii="Calibri" w:eastAsia="Calibri" w:hAnsi="Calibri" w:cs="Calibri"/>
         </w:rPr>
       </w:pPr>
-      <w:bookmarkStart w:id="13" w:name="_heading=h.15jd6ru3fgp0" w:colFirst="0" w:colLast="0"/>
-      <w:bookmarkEnd w:id="13"/>
+      <w:bookmarkStart w:id="12" w:name="_heading=h.15jd6ru3fgp0" w:colFirst="0" w:colLast="0"/>
+      <w:bookmarkEnd w:id="12"/>
       <w:r>
         <w:rPr>
           <w:rFonts w:ascii="Calibri" w:eastAsia="Calibri" w:hAnsi="Calibri" w:cs="Calibri"/>
@@ -3580,6 +3572,54 @@
     </w:p>
     <w:p>
       <w:pPr>
+        <w:ind w:left="1797"/>
+        <w:jc w:val="both"/>
+        <w:rPr>
+          <w:rFonts w:ascii="Calibri" w:eastAsia="Calibri" w:hAnsi="Calibri" w:cs="Calibri"/>
+          <w:color w:val="000000"/>
+        </w:rPr>
+      </w:pPr>
+      <w:r>
+        <w:rPr>
+          <w:rFonts w:ascii="Calibri" w:eastAsia="Calibri" w:hAnsi="Calibri" w:cs="Calibri"/>
+          <w:b/>
+          <w:i/>
+          <w:color w:val="000000"/>
+        </w:rPr>
+        <w:t>INTERBANK:</w:t>
+      </w:r>
+      <w:r>
+        <w:rPr>
+          <w:rFonts w:ascii="Calibri" w:eastAsia="Calibri" w:hAnsi="Calibri" w:cs="Calibri"/>
+          <w:i/>
+          <w:color w:val="000000"/>
+        </w:rPr>
+        <w:t>7203004599099 / CCI: 00372000300459909908</w:t>
+      </w:r>
+    </w:p>
+    <w:p>
+      <w:pPr>
+        <w:pBdr>
+          <w:top w:val="nil"/>
+          <w:left w:val="nil"/>
+          <w:bottom w:val="nil"/>
+          <w:right w:val="nil"/>
+          <w:between w:val="nil"/>
+        </w:pBdr>
+        <w:ind w:left="1797"/>
+        <w:jc w:val="both"/>
+        <w:rPr>
+          <w:rFonts w:ascii="Calibri" w:eastAsia="Calibri" w:hAnsi="Calibri" w:cs="Calibri"/>
+          <w:i/>
+          <w:iCs/>
+          <w:color w:val="000000"/>
+        </w:rPr>
+      </w:pPr>
+      <w:bookmarkStart w:id="13" w:name="_GoBack"/>
+      <w:bookmarkEnd w:id="13"/>
+    </w:p>
+    <w:p>
+      <w:pPr>
         <w:pBdr>
           <w:top w:val="nil"/>
           <w:left w:val="nil"/>
@@ -3718,27 +3758,19 @@
         <w:rPr>
           <w:rFonts w:ascii="Calibri" w:eastAsia="Calibri" w:hAnsi="Calibri" w:cs="Calibri"/>
         </w:rPr>
-        <w:t>Los precios detallados son considerados para la ciudad de</w:t>
-      </w:r>
-      <w:r>
-        <w:rPr>
-          <w:rFonts w:ascii="Calibri" w:eastAsia="Calibri" w:hAnsi="Calibri" w:cs="Calibri"/>
-          <w:highlight w:val="red"/>
-        </w:rPr>
-        <w:t xml:space="preserve"> </w:t>
+        <w:t xml:space="preserve">Los precios detallados son considerados para la ciudad </w:t>
+      </w:r>
+      <w:r>
+        <w:rPr>
+          <w:rFonts w:ascii="Calibri" w:eastAsia="Calibri" w:hAnsi="Calibri" w:cs="Calibri"/>
+        </w:rPr>
+        <w:t xml:space="preserve">de </w:t>
       </w:r>
       <w:bookmarkStart w:id="14" w:name="Ciudad"/>
-      <w:r>
-        <w:rPr>
-          <w:rFonts w:ascii="Calibri" w:eastAsia="Calibri" w:hAnsi="Calibri" w:cs="Calibri"/>
-          <w:highlight w:val="red"/>
-        </w:rPr>
-      </w:r>
       <w:bookmarkEnd w:id="14"/>
       <w:r>
         <w:rPr>
           <w:rFonts w:ascii="Calibri" w:eastAsia="Calibri" w:hAnsi="Calibri" w:cs="Calibri"/>
-          <w:highlight w:val="red"/>
         </w:rPr>
         <w:t>.</w:t>
       </w:r>
@@ -3824,6 +3856,7 @@
         <w:rPr>
           <w:rFonts w:ascii="Calibri" w:eastAsia="Calibri" w:hAnsi="Calibri" w:cs="Calibri"/>
         </w:rPr>
+        <w:lastRenderedPageBreak/>
         <w:t>La empresa NO elabora o emite comprobantes de pago, es responsabilidad del contribuyente.</w:t>
       </w:r>
     </w:p>
@@ -3843,7 +3876,6 @@
         <w:rPr>
           <w:rFonts w:ascii="Calibri" w:eastAsia="Calibri" w:hAnsi="Calibri" w:cs="Calibri"/>
         </w:rPr>
-        <w:lastRenderedPageBreak/>
         <w:t>La empresa no recibe dinero adicional que no sea por el pago de los servicios.</w:t>
       </w:r>
     </w:p>

</xml_diff>